<commit_message>
Cap hot topics at 2 per sport; use [HOT] tag; update topics doc
Co-Authored-By: Claude Sonnet 5.5 <noreply@anthropic.com>
</commit_message>
<xml_diff>
--- a/2026-10-06/topics.docx
+++ b/2026-10-06/topics.docx
@@ -12,7 +12,7 @@
     </w:p>
     <w:p>
       <w:r>
-        <w:t>Researched 2026-09-29. 🔥 = Hot (trending/breaking). Pick 4 per page (one per pillar ideally: Player Aura, Rivalries, Past Tournaments, League Fun). Mark up and finalize on shoot day.</w:t>
+        <w:t>Researched 2026-09-29. [HOT] = trending/breaking (2 per page). Pick 4 per page (one per pillar ideally: Player Aura, Rivalries, Past Tournaments, League Fun). Mark up and finalize on shoot day.</w:t>
       </w:r>
     </w:p>
     <w:p>
@@ -28,7 +28,7 @@
         <w:rPr>
           <w:b/>
         </w:rPr>
-        <w:t>1. Mbappé's Second Golden Boot: The Record Nobody Else Has  🔥 Hot</w:t>
+        <w:t>1. Mbappé's Second Golden Boot: The Record Nobody Else Has  [HOT]</w:t>
       </w:r>
       <w:r>
         <w:br/>
@@ -42,7 +42,7 @@
         <w:rPr>
           <w:b/>
         </w:rPr>
-        <w:t>2. Lamine Yamal vs the Ballon d'Or  🔥 Hot</w:t>
+        <w:t>2. Lamine Yamal vs the Ballon d'Or  [HOT]</w:t>
       </w:r>
       <w:r>
         <w:br/>
@@ -56,7 +56,7 @@
         <w:rPr>
           <w:b/>
         </w:rPr>
-        <w:t>3. Messi's Goalless Final: Was That the Last Dance?  🔥 Hot</w:t>
+        <w:t>3. Messi's Goalless Final: Was That the Last Dance?</w:t>
       </w:r>
       <w:r>
         <w:br/>
@@ -70,7 +70,7 @@
         <w:rPr>
           <w:b/>
         </w:rPr>
-        <w:t>4. Spain vs Argentina: The New Kings vs the Old  🔥 Hot</w:t>
+        <w:t>4. Spain vs Argentina: The New Kings vs the Old</w:t>
       </w:r>
       <w:r>
         <w:br/>
@@ -84,7 +84,7 @@
         <w:rPr>
           <w:b/>
         </w:rPr>
-        <w:t>5. Arsenal vs Real Madrid &amp; Bayern: A Champions League Trap Door  🔥 Hot</w:t>
+        <w:t>5. Arsenal vs Real Madrid &amp; Bayern: A Champions League Trap Door</w:t>
       </w:r>
       <w:r>
         <w:br/>
@@ -98,7 +98,7 @@
         <w:rPr>
           <w:b/>
         </w:rPr>
-        <w:t>6. Haaland Starts Season 5 Goals Deep  🔥 Hot</w:t>
+        <w:t>6. Haaland Starts Season 5 Goals Deep</w:t>
       </w:r>
       <w:r>
         <w:br/>
@@ -148,7 +148,7 @@
         <w:rPr>
           <w:b/>
         </w:rPr>
-        <w:t>1. India Defend Asian Games Gold — Shreyas Iyer's Test  🔥 Hot</w:t>
+        <w:t>1. India Defend Asian Games Gold — Shreyas Iyer's Test  [HOT]</w:t>
       </w:r>
       <w:r>
         <w:br/>
@@ -176,7 +176,7 @@
         <w:rPr>
           <w:b/>
         </w:rPr>
-        <w:t>3. Bumrah at the Asian Games: Is He Wasted Here?  🔥 Hot</w:t>
+        <w:t>3. Bumrah at the Asian Games: Is He Wasted Here?</w:t>
       </w:r>
       <w:r>
         <w:br/>
@@ -190,7 +190,7 @@
         <w:rPr>
           <w:b/>
         </w:rPr>
-        <w:t>4. India vs Pakistan: Rivalry Beyond the Handshakes  🔥 Hot</w:t>
+        <w:t>4. India vs Pakistan: Rivalry Beyond the Handshakes</w:t>
       </w:r>
       <w:r>
         <w:br/>
@@ -232,7 +232,7 @@
         <w:rPr>
           <w:b/>
         </w:rPr>
-        <w:t>7. Vaibhav Suryavanshi: India's 15-Year-Old Phenomenon, One Year On  🔥 Hot</w:t>
+        <w:t>7. Vaibhav Suryavanshi: India's 15-Year-Old Phenomenon, One Year On  [HOT]</w:t>
       </w:r>
       <w:r>
         <w:br/>
@@ -268,7 +268,7 @@
         <w:rPr>
           <w:b/>
         </w:rPr>
-        <w:t>1. Sinner's Missed Slam: The Cost of a Knee  🔥 Hot</w:t>
+        <w:t>1. Sinner's Missed Slam: The Cost of a Knee  [HOT]</w:t>
       </w:r>
       <w:r>
         <w:br/>
@@ -282,7 +282,7 @@
         <w:rPr>
           <w:b/>
         </w:rPr>
-        <w:t>2. Zverev Finally Gets It Done  🔥 Hot</w:t>
+        <w:t>2. Zverev Finally Gets It Done  [HOT]</w:t>
       </w:r>
       <w:r>
         <w:br/>
@@ -296,7 +296,7 @@
         <w:rPr>
           <w:b/>
         </w:rPr>
-        <w:t>3. Alcaraz vs Sinner: 10-5 and Counting  🔥 Hot</w:t>
+        <w:t>3. Alcaraz vs Sinner: 10-5 and Counting</w:t>
       </w:r>
       <w:r>
         <w:br/>
@@ -310,7 +310,7 @@
         <w:rPr>
           <w:b/>
         </w:rPr>
-        <w:t>4. Satwik-Chirag: Defending Asian Games Gold  🔥 Hot</w:t>
+        <w:t>4. Satwik-Chirag: Defending Asian Games Gold</w:t>
       </w:r>
       <w:r>
         <w:br/>
@@ -324,7 +324,7 @@
         <w:rPr>
           <w:b/>
         </w:rPr>
-        <w:t>5. PV Sindhu's Road to Asian Games Through Chen Yufei  🔥 Hot</w:t>
+        <w:t>5. PV Sindhu's Road to Asian Games Through Chen Yufei</w:t>
       </w:r>
       <w:r>
         <w:br/>

</xml_diff>

<commit_message>
Finalize 12 topics for 2026-10-06 shoot; log them; global cricket list
Co-Authored-By: Claude Sonnet 5.5 <noreply@anthropic.com>
</commit_message>
<xml_diff>
--- a/2026-10-06/topics.docx
+++ b/2026-10-06/topics.docx
@@ -12,7 +12,7 @@
     </w:p>
     <w:p>
       <w:r>
-        <w:t>Researched 2026-09-29. [HOT] = trending/breaking (2 per page). Pick 4 per page (one per pillar ideally: Player Aura, Rivalries, Past Tournaments, League Fun). Mark up and finalize on shoot day.</w:t>
+        <w:t>Researched 2026-09-29. [HOT] = trending/breaking (2 per page). Pick 4 per page (one per pillar ideally: Player Aura, Rivalries, Past Tournaments, League Fun). ★ SELECTED = final 4 per page.</w:t>
       </w:r>
     </w:p>
     <w:p>
@@ -42,7 +42,7 @@
         <w:rPr>
           <w:b/>
         </w:rPr>
-        <w:t>2. Lamine Yamal vs the Ballon d'Or  [HOT]</w:t>
+        <w:t>2. Lamine Yamal vs the Ballon d'Or  [HOT]  ★ SELECTED</w:t>
       </w:r>
       <w:r>
         <w:br/>
@@ -70,7 +70,7 @@
         <w:rPr>
           <w:b/>
         </w:rPr>
-        <w:t>4. Spain vs Argentina: The New Kings vs the Old</w:t>
+        <w:t>4. Spain vs Argentina: The New Kings vs the Old  ★ SELECTED</w:t>
       </w:r>
       <w:r>
         <w:br/>
@@ -112,7 +112,7 @@
         <w:rPr>
           <w:b/>
         </w:rPr>
-        <w:t>7. How the 2026 World Cup Was Actually Won: Spain's System Explained</w:t>
+        <w:t>7. How the 2026 World Cup Was Actually Won: Spain's System Explained  ★ SELECTED</w:t>
       </w:r>
       <w:r>
         <w:br/>
@@ -126,7 +126,7 @@
         <w:rPr>
           <w:b/>
         </w:rPr>
-        <w:t>8. Top 5 World Cup 2026 Moments You Already Forgot</w:t>
+        <w:t>8. Top 5 World Cup 2026 Moments You Already Forgot  ★ SELECTED</w:t>
       </w:r>
       <w:r>
         <w:br/>
@@ -140,7 +140,7 @@
         <w:pStyle w:val="Heading1"/>
       </w:pPr>
       <w:r>
-        <w:t>Cricket (8 candidates)</w:t>
+        <w:t>Cricket (9 candidates)</w:t>
       </w:r>
     </w:p>
     <w:p>
@@ -148,13 +148,13 @@
         <w:rPr>
           <w:b/>
         </w:rPr>
-        <w:t>1. India Defend Asian Games Gold — Shreyas Iyer's Test  [HOT]</w:t>
+        <w:t>1. Harry Brook: England's New Captain, Player of the T20I Series  [HOT]  ★ SELECTED</w:t>
       </w:r>
       <w:r>
         <w:br/>
         <w:t>Pillar: Player Aura</w:t>
         <w:br/>
-        <w:t>Angle: Iyer captains a full-strength side (with Bumrah) into the semis after the Afghanistan quarter-final washout.</w:t>
+        <w:t>Angle: Led England to a 3-0 T20I sweep and 2-1 ODI win over Sri Lanka — is he the face of England's next era?</w:t>
       </w:r>
     </w:p>
     <w:p>
@@ -162,13 +162,13 @@
         <w:rPr>
           <w:b/>
         </w:rPr>
-        <w:t>2. Ruturaj Gaikwad: The Forgotten Asian Games Champion Captain</w:t>
+        <w:t>2. Will Jacks: The All-Rounder Who Finally Arrived  [HOT]</w:t>
       </w:r>
       <w:r>
         <w:br/>
         <w:t>Pillar: Player Aura</w:t>
         <w:br/>
-        <w:t>Angle: He led India to gold in 2022, now watching from outside — an underrated-player story.</w:t>
+        <w:t>Angle: Player of the ODI series vs Sri Lanka (top wicket-taker for England) — years of 'potential' turning into results.</w:t>
       </w:r>
     </w:p>
     <w:p>
@@ -176,13 +176,13 @@
         <w:rPr>
           <w:b/>
         </w:rPr>
-        <w:t>3. Bumrah at the Asian Games: Is He Wasted Here?</w:t>
+        <w:t>3. Joe Root vs Tendulkar's Test Run Record</w:t>
       </w:r>
       <w:r>
         <w:br/>
-        <w:t>Pillar: League Fun</w:t>
+        <w:t>Pillar: Player Aura</w:t>
         <w:br/>
-        <w:t>Angle: Debate prompt: should India send its best fast bowler to a multi-sport event with a Windies series looming?</w:t>
+        <w:t>Angle: How close is Root to the all-time Test runs mark, and what would it take to catch it?</w:t>
       </w:r>
     </w:p>
     <w:p>
@@ -190,13 +190,13 @@
         <w:rPr>
           <w:b/>
         </w:rPr>
-        <w:t>4. India vs Pakistan: Rivalry Beyond the Handshakes</w:t>
+        <w:t>4. Rashid Khan: The Spinner Who Put Afghanistan on the Map</w:t>
       </w:r>
       <w:r>
         <w:br/>
-        <w:t>Pillar: Rivalries</w:t>
+        <w:t>Pillar: Player Aura</w:t>
         <w:br/>
-        <w:t>Angle: Pakistan are in the Asian Games knockout bracket alongside India — a possible final-stage clash revives cricket's biggest rivalry.</w:t>
+        <w:t>Angle: Underrated-legacy angle: one man's impact on a nation's cricket rise.</w:t>
       </w:r>
     </w:p>
     <w:p>
@@ -204,13 +204,13 @@
         <w:rPr>
           <w:b/>
         </w:rPr>
-        <w:t>5. Kohli vs Australia: A Rivalry in Numbers</w:t>
+        <w:t>5. Australia vs England: The Ashes 4-1 and What's Next  ★ SELECTED</w:t>
       </w:r>
       <w:r>
         <w:br/>
         <w:t>Pillar: Rivalries</w:t>
         <w:br/>
-        <w:t>Angle: Pull the numbers behind the sport's spikiest modern individual rivalry.</w:t>
+        <w:t>Angle: Australia took the 2025-26 Ashes 4-1 — what does the next chapter of cricket's oldest rivalry look like?</w:t>
       </w:r>
     </w:p>
     <w:p>
@@ -218,13 +218,13 @@
         <w:rPr>
           <w:b/>
         </w:rPr>
-        <w:t>6. The 2011 World Cup Final: Dhoni's Six, Frame by Frame</w:t>
+        <w:t>6. Australia vs South Africa: The Rivalry That Always Goes the Distance</w:t>
       </w:r>
       <w:r>
         <w:br/>
-        <w:t>Pillar: Past Tournaments</w:t>
+        <w:t>Pillar: Rivalries</w:t>
         <w:br/>
-        <w:t>Angle: The most replayed six in Indian sport — what actually happened in the over before it.</w:t>
+        <w:t>Angle: Tense ICC knockouts and the upcoming 2026-27 tour — two sides who never make it easy.</w:t>
       </w:r>
     </w:p>
     <w:p>
@@ -232,13 +232,13 @@
         <w:rPr>
           <w:b/>
         </w:rPr>
-        <w:t>7. Vaibhav Suryavanshi: India's 15-Year-Old Phenomenon, One Year On  [HOT]</w:t>
+        <w:t>7. The 2019 World Cup Final at Lord's: The Boundary-Count Final  ★ SELECTED</w:t>
       </w:r>
       <w:r>
         <w:br/>
-        <w:t>Pillar: Player Aura</w:t>
+        <w:t>Pillar: Past Tournaments</w:t>
         <w:br/>
-        <w:t>Angle: Named in India's Asian Games squad — how far has the teen sensation really come?</w:t>
+        <w:t>Angle: England vs New Zealand — the most dramatic final ever, and the rule that decided it.</w:t>
       </w:r>
     </w:p>
     <w:p>
@@ -246,13 +246,27 @@
         <w:rPr>
           <w:b/>
         </w:rPr>
-        <w:t>8. Top 5 Fastest ODI Hundreds — and Who Holds India's</w:t>
+        <w:t>8. 1999 World Cup Semi-Final: The Tie That Sent Australia Through</w:t>
+      </w:r>
+      <w:r>
+        <w:br/>
+        <w:t>Pillar: Past Tournaments</w:t>
+        <w:br/>
+        <w:t>Angle: Australia vs South Africa at Edgbaston — Klusener, Donald and the run-out that changed everything.</w:t>
+      </w:r>
+    </w:p>
+    <w:p>
+      <w:r>
+        <w:rPr>
+          <w:b/>
+        </w:rPr>
+        <w:t>9. Top 5 Fastest Test Hundreds — Ever  ★ SELECTED</w:t>
       </w:r>
       <w:r>
         <w:br/>
         <w:t>Pillar: League Fun</w:t>
         <w:br/>
-        <w:t>Angle: Numbers/records format with a strong 'guess the #1' hook.</w:t>
+        <w:t>Angle: Records format with a strong 'guess the #1' hook.</w:t>
       </w:r>
     </w:p>
     <w:p>
@@ -268,7 +282,7 @@
         <w:rPr>
           <w:b/>
         </w:rPr>
-        <w:t>1. Sinner's Missed Slam: The Cost of a Knee  [HOT]</w:t>
+        <w:t>1. Sinner's Missed Slam: The Cost of a Knee  [HOT]  ★ SELECTED</w:t>
       </w:r>
       <w:r>
         <w:br/>
@@ -296,7 +310,7 @@
         <w:rPr>
           <w:b/>
         </w:rPr>
-        <w:t>3. Alcaraz vs Sinner: 10-5 and Counting</w:t>
+        <w:t>3. Alcaraz vs Sinner: 10-5 and Counting  ★ SELECTED</w:t>
       </w:r>
       <w:r>
         <w:br/>
@@ -338,7 +352,7 @@
         <w:rPr>
           <w:b/>
         </w:rPr>
-        <w:t>6. Federer vs Nadal: The Match That Defined a Rivalry (Wimbledon 2008)</w:t>
+        <w:t>6. Federer vs Nadal: The Match That Defined a Rivalry (Wimbledon 2008)  ★ SELECTED</w:t>
       </w:r>
       <w:r>
         <w:br/>
@@ -352,7 +366,7 @@
         <w:rPr>
           <w:b/>
         </w:rPr>
-        <w:t>7. Top 5 Badminton Rallies That Broke the Internet</w:t>
+        <w:t>7. Top 5 Badminton Rallies That Broke the Internet  ★ SELECTED</w:t>
       </w:r>
       <w:r>
         <w:br/>

</xml_diff>

<commit_message>
Swap 4 already-produced topics for 2026-10-06
Co-Authored-By: Claude Sonnet 5.5 <noreply@anthropic.com>
</commit_message>
<xml_diff>
--- a/2026-10-06/topics.docx
+++ b/2026-10-06/topics.docx
@@ -20,7 +20,7 @@
         <w:pStyle w:val="Heading1"/>
       </w:pPr>
       <w:r>
-        <w:t>Football (8 candidates)</w:t>
+        <w:t>Football (9 candidates)</w:t>
       </w:r>
     </w:p>
     <w:p>
@@ -70,7 +70,7 @@
         <w:rPr>
           <w:b/>
         </w:rPr>
-        <w:t>4. Spain vs Argentina: The New Kings vs the Old  ★ SELECTED</w:t>
+        <w:t>4. Spain vs Argentina: The New Kings vs the Old</w:t>
       </w:r>
       <w:r>
         <w:br/>
@@ -84,7 +84,7 @@
         <w:rPr>
           <w:b/>
         </w:rPr>
-        <w:t>5. Arsenal vs Real Madrid &amp; Bayern: A Champions League Trap Door</w:t>
+        <w:t>5. Arsenal vs Real Madrid &amp; Bayern: A Champions League Trap Door  ★ SELECTED</w:t>
       </w:r>
       <w:r>
         <w:br/>
@@ -112,7 +112,7 @@
         <w:rPr>
           <w:b/>
         </w:rPr>
-        <w:t>7. How the 2026 World Cup Was Actually Won: Spain's System Explained  ★ SELECTED</w:t>
+        <w:t>7. How the 2026 World Cup Was Actually Won: Spain's System Explained</w:t>
       </w:r>
       <w:r>
         <w:br/>
@@ -126,7 +126,21 @@
         <w:rPr>
           <w:b/>
         </w:rPr>
-        <w:t>8. Top 5 World Cup 2026 Moments You Already Forgot  ★ SELECTED</w:t>
+        <w:t>8. Euro 2004: How Greece Shocked Europe  ★ SELECTED</w:t>
+      </w:r>
+      <w:r>
+        <w:br/>
+        <w:t>Pillar: Past Tournaments</w:t>
+        <w:br/>
+        <w:t>Angle: The 150-1 outsiders who won it all with defence and set pieces — football's greatest underdog story.</w:t>
+      </w:r>
+    </w:p>
+    <w:p>
+      <w:r>
+        <w:rPr>
+          <w:b/>
+        </w:rPr>
+        <w:t>9. Top 5 World Cup 2026 Moments You Already Forgot  ★ SELECTED</w:t>
       </w:r>
       <w:r>
         <w:br/>
@@ -232,7 +246,7 @@
         <w:rPr>
           <w:b/>
         </w:rPr>
-        <w:t>7. The 2019 World Cup Final at Lord's: The Boundary-Count Final  ★ SELECTED</w:t>
+        <w:t>7. The 2019 World Cup Final at Lord's: The Boundary-Count Final</w:t>
       </w:r>
       <w:r>
         <w:br/>
@@ -246,7 +260,7 @@
         <w:rPr>
           <w:b/>
         </w:rPr>
-        <w:t>8. 1999 World Cup Semi-Final: The Tie That Sent Australia Through</w:t>
+        <w:t>8. 1999 World Cup Semi-Final: The Tie That Sent Australia Through  ★ SELECTED</w:t>
       </w:r>
       <w:r>
         <w:br/>
@@ -274,7 +288,7 @@
         <w:pStyle w:val="Heading1"/>
       </w:pPr>
       <w:r>
-        <w:t>Racket (7 candidates)</w:t>
+        <w:t>Racket (8 candidates)</w:t>
       </w:r>
     </w:p>
     <w:p>
@@ -352,7 +366,7 @@
         <w:rPr>
           <w:b/>
         </w:rPr>
-        <w:t>6. Federer vs Nadal: The Match That Defined a Rivalry (Wimbledon 2008)  ★ SELECTED</w:t>
+        <w:t>6. Federer vs Nadal: The Match That Defined a Rivalry (Wimbledon 2008)</w:t>
       </w:r>
       <w:r>
         <w:br/>
@@ -366,7 +380,21 @@
         <w:rPr>
           <w:b/>
         </w:rPr>
-        <w:t>7. Top 5 Badminton Rallies That Broke the Internet  ★ SELECTED</w:t>
+        <w:t>7. Sindhu's 2019 World Championship Gold in Basel  ★ SELECTED</w:t>
+      </w:r>
+      <w:r>
+        <w:br/>
+        <w:t>Pillar: Past Tournaments</w:t>
+        <w:br/>
+        <w:t>Angle: India's first women's singles world champion — the final, the fight and the 38-minute demolition of Okuhara.</w:t>
+      </w:r>
+    </w:p>
+    <w:p>
+      <w:r>
+        <w:rPr>
+          <w:b/>
+        </w:rPr>
+        <w:t>8. Top 5 Badminton Rallies That Broke the Internet  ★ SELECTED</w:t>
       </w:r>
       <w:r>
         <w:br/>

</xml_diff>